<commit_message>
Pre-final version of Chapter 6 Fieldcraft completed
</commit_message>
<xml_diff>
--- a/resources/essenceOfStoneRU.docx
+++ b/resources/essenceOfStoneRU.docx
@@ -222,7 +222,7 @@
             <w:rPr>
               <w:lang w:val="ru-RU"/>
             </w:rPr>
-            <w:t>Contents</w:t>
+            <w:t>Содержание</w:t>
           </w:r>
         </w:p>
         <w:p>
@@ -8487,11 +8487,7 @@
     </w:p>
     <w:p>
       <w:r>
-        <w:t xml:space="preserve">— Это, — прокомментировал Арт, — номер Варианта, который сейчас за Вратами. Нам нужен Вариант 1. Как только он появится, исходим из того, что у нас пять минут — это минимальное время между сменами Вариантов. Нам нужно постараться пройти Врата в течение этих пяти минут. Причём </w:t>
-      </w:r>
-      <w:r>
-        <w:lastRenderedPageBreak/>
-        <w:t>мы должны именно пройти, дрифтер во Вратах не работает. Также мы должны будем отключить все электронные устройства, в том числе, маску и клипсу.</w:t>
+        <w:t>— Это, — прокомментировал Арт, — номер Варианта, который сейчас за Вратами. Нам нужен Вариант 1. Как только он появится, исходим из того, что у нас пять минут — это минимальное время между сменами Вариантов. Нам нужно постараться пройти Врата в течение этих пяти минут. Причём мы должны именно пройти, дрифтер во Вратах не работает. Также мы должны будем отключить все электронные устройства, в том числе, маску и клипсу.</w:t>
       </w:r>
     </w:p>
     <w:p>
@@ -8571,7 +8567,6 @@
     </w:p>
     <w:p>
       <w:r>
-        <w:lastRenderedPageBreak/>
         <w:t>А потом я шагнул во Врата.</w:t>
       </w:r>
     </w:p>
@@ -8643,7 +8638,6 @@
       </w:pPr>
       <w:bookmarkStart w:id="22" w:name="_Toc238978498"/>
       <w:r>
-        <w:lastRenderedPageBreak/>
         <w:t>Глава 1. Ложная память 1: Пикер Эссенции</w:t>
       </w:r>
       <w:bookmarkEnd w:id="22"/>
@@ -8720,7 +8714,6 @@
     </w:p>
     <w:p>
       <w:r>
-        <w:lastRenderedPageBreak/>
         <w:t>Внешние поверхности стен и крыши дома были адаптивными, от чего дом казался почти живым. Он реагировал на температуру, освещённость и даже на настроение хозяев: днём поверхность стен становилась почти матовой, отражая избыток света, а вечером мягко теплела, словно выдыхая изнутри янтарное свечение. Мне иногда казалось, что дом дышит.</w:t>
       </w:r>
     </w:p>
@@ -8780,7 +8773,6 @@
     </w:p>
     <w:p>
       <w:r>
-        <w:lastRenderedPageBreak/>
         <w:t>Жильё стало чем-то вроде гибридного сервиса — промежуточным звеном между домом, отелем и личным пространством. Можно, к примеру, легко перебраться из юнита в небоскрёбе мегаполиса с его стремительным ритмом и океаном развлечений в уединённый дом на отроге гор или на берегу океана, где слышен только шум ветра и прибоя. Многие предпочитают «ротационный» стиль жизни, меняя среду каждые несколько месяцев: мегаполис — для проектов, побережье — для отдыха, исследовательский купол в тропиках — для вдохновения.</w:t>
       </w:r>
     </w:p>
@@ -8826,11 +8818,7 @@
     </w:p>
     <w:p>
       <w:r>
-        <w:t xml:space="preserve">По определению, такие сооружения можно строить только вдоль экватора, поэтому три канатки расположены в Андане, две в Африке, одна в Азии, а ещё две прикреплены к платформам в открытом океане. Проект, на котором я работал, добавлял к африканским канаткам ещё одну — третью. Кроме того, несколько объектов нашей компании находятся на Астриде — так обычно называются внеземные территории. Две магистрали Орбит Коннект действуют на Луне, где такие системы строить намного проще, благодаря низкой гравитации, почти полному отсутствию атмосферы и, </w:t>
-      </w:r>
-      <w:r>
-        <w:lastRenderedPageBreak/>
-        <w:t xml:space="preserve">соответственно, меньшим требованиям к длине троса. Одна канатка расположена на Марсе, и там она тоже короче земной — почти вдвое — благодаря меньшему радиусу планеты и слабой гравитации. Ну и кроме того, насколько я знаю, в разработке находятся проекты канаток на астероидах Пояса — по-моему, на Психее и Церере. </w:t>
+        <w:t xml:space="preserve">По определению, такие сооружения можно строить только вдоль экватора, поэтому три канатки расположены в Андане, две в Африке, одна в Азии, а ещё две прикреплены к платформам в открытом океане. Проект, на котором я работал, добавлял к африканским канаткам ещё одну — третью. Кроме того, несколько объектов нашей компании находятся на Астриде — так обычно называются внеземные территории. Две магистрали Орбит Коннект действуют на Луне, где такие системы строить намного проще, благодаря низкой гравитации, почти полному отсутствию атмосферы и, соответственно, меньшим требованиям к длине троса. Одна канатка расположена на Марсе, и там она тоже короче земной — почти вдвое — благодаря меньшему радиусу планеты и слабой гравитации. Ну и кроме того, насколько я знаю, в разработке находятся проекты канаток на астероидах Пояса — по-моему, на Психее и Церере. </w:t>
       </w:r>
     </w:p>
     <w:p>
@@ -8870,11 +8858,7 @@
     </w:p>
     <w:p>
       <w:r>
-        <w:t xml:space="preserve">Таких горизонтов в каждом уровне, начиная с первого, — двенадцать, и направление движения в каждом из них как бы сдвинуто по отношению к предыдущему по часовой стрелке на тридцать градусов или, как ещё говорят, по аналогии с циферблатом, — на пять минут. Если ты движешься в </w:t>
-      </w:r>
-      <w:r>
-        <w:lastRenderedPageBreak/>
-        <w:t>направлении, не соответствующем заданному, ты обязан уступить дорогу всем другим участникам воздушного движения.</w:t>
+        <w:t>Таких горизонтов в каждом уровне, начиная с первого, — двенадцать, и направление движения в каждом из них как бы сдвинуто по отношению к предыдущему по часовой стрелке на тридцать градусов или, как ещё говорят, по аналогии с циферблатом, — на пять минут. Если ты движешься в направлении, не соответствующем заданному, ты обязан уступить дорогу всем другим участникам воздушного движения.</w:t>
       </w:r>
     </w:p>
     <w:p>
@@ -8924,11 +8908,7 @@
     </w:p>
     <w:p>
       <w:r>
-        <w:t xml:space="preserve">Конечно же, неотъемлемой частью Сети, да и всего нашего мира в целом, является Сетевой Помощник — или просто СП. Не помню, кому принадлежит эта фраза — то ли какому-то писателю, то ли стендап-комику: «Главное достоинство Сетевого Помощника в том, что он не умеет скучать». И это, по-моему, чистая правда. Самая большая польза, которую приносит СП, вошедший в нашу жизнь больше века назад, заключается в том, что он взял на себя всю скучную, однообразную, </w:t>
-      </w:r>
-      <w:r>
-        <w:lastRenderedPageBreak/>
-        <w:t>утомительную и рутинную работу. И делает её так, как никто из людей никогда бы не смог: точно, последовательно, без усталости, без раздражения и без жалоб. Если представить обратное — что мы должны были бы выполнять за СП весь этот бесконечный объём скучной рутины — человечество, наверное, просто взвыло бы.</w:t>
+        <w:t>Конечно же, неотъемлемой частью Сети, да и всего нашего мира в целом, является Сетевой Помощник — или просто СП. Не помню, кому принадлежит эта фраза — то ли какому-то писателю, то ли стендап-комику: «Главное достоинство Сетевого Помощника в том, что он не умеет скучать». И это, по-моему, чистая правда. Самая большая польза, которую приносит СП, вошедший в нашу жизнь больше века назад, заключается в том, что он взял на себя всю скучную, однообразную, утомительную и рутинную работу. И делает её так, как никто из людей никогда бы не смог: точно, последовательно, без усталости, без раздражения и без жалоб. Если представить обратное — что мы должны были бы выполнять за СП весь этот бесконечный объём скучной рутины — человечество, наверное, просто взвыло бы.</w:t>
       </w:r>
     </w:p>
     <w:p>
@@ -8963,11 +8943,7 @@
     </w:p>
     <w:p>
       <w:r>
-        <w:t xml:space="preserve">За всю историю существования СП мода на персонификацию и «очеловечивание» прошла уже несколько больших циклов. Сначала люди разговаривали со своими помощниками подчеркнуто формально, как с сухими автоматами. Потом, наоборот, наступила эпоха дружелюбных интерфейсов, когда все подряд устанавливали своим СП приятные голоса, придумывали им имена и оформляли диалоговые окна так, будто это переписка со старыми знакомыми. Затем наступил период «анти-гуманизации»: считалось хорошим тоном общаться с СП только командами, без эмоций, без имитации личности — словно подчёркивая дистанцию между человеком и машиной. А несколько десятилетий назад маятник качнулся снова. Людям надоела сухая функциональность, и постепенно в моду вернулась персонификация, но уже более зрелая, без прежней наивности. Теперь никого не удивляло, что многие называют своего СП обычными человеческими именами и общаются с ним — или с ней — как с живым собеседником. Не потому, что СП действительно обладал личностью. А потому что человеку проще и приятнее говорить с голосом, который звучит тепло, а не металлически; </w:t>
-      </w:r>
-      <w:r>
-        <w:lastRenderedPageBreak/>
-        <w:t>слушать интонации, в которых угадывается оттенок заботы; ощущать, что тебя понимают, даже если понимает тебя алгоритм.</w:t>
+        <w:t>За всю историю существования СП мода на персонификацию и «очеловечивание» прошла уже несколько больших циклов. Сначала люди разговаривали со своими помощниками подчеркнуто формально, как с сухими автоматами. Потом, наоборот, наступила эпоха дружелюбных интерфейсов, когда все подряд устанавливали своим СП приятные голоса, придумывали им имена и оформляли диалоговые окна так, будто это переписка со старыми знакомыми. Затем наступил период «анти-гуманизации»: считалось хорошим тоном общаться с СП только командами, без эмоций, без имитации личности — словно подчёркивая дистанцию между человеком и машиной. А несколько десятилетий назад маятник качнулся снова. Людям надоела сухая функциональность, и постепенно в моду вернулась персонификация, но уже более зрелая, без прежней наивности. Теперь никого не удивляло, что многие называют своего СП обычными человеческими именами и общаются с ним — или с ней — как с живым собеседником. Не потому, что СП действительно обладал личностью. А потому что человеку проще и приятнее говорить с голосом, который звучит тепло, а не металлически; слушать интонации, в которых угадывается оттенок заботы; ощущать, что тебя понимают, даже если понимает тебя алгоритм.</w:t>
       </w:r>
     </w:p>
     <w:p>
@@ -9012,7 +8988,6 @@
     </w:p>
     <w:p>
       <w:r>
-        <w:lastRenderedPageBreak/>
         <w:t>Сходство усиливали транспортные кабины, которые сновали вдоль внешних поверхностей башен и галерей, цепляясь за магнитные рельсы, а также глайдеры и дрифтеры, парящие между строениями или припаркованные на навесных платформах у стен. Весь этот рой движущихся объектов создавал непрерывное ощущение живого и самодостаточного городского организма.</w:t>
       </w:r>
     </w:p>
@@ -9063,11 +9038,7 @@
     </w:p>
     <w:p>
       <w:r>
-        <w:t xml:space="preserve">В нашем квартале, всего несколькими этажами выше моего уровня, располагалась просторная плаза с торговыми центрами, кафе, студиями развлечений и небольшими зелёными двориками, скрытыми </w:t>
-      </w:r>
-      <w:r>
-        <w:lastRenderedPageBreak/>
-        <w:t>между галереями. Это место никогда не пустовало: кто-то сидел в уличных лаунжах, кто-то созванивался по работе прямо на ходу, а кто-то зависал в игровых капсулах, встроенных в стены.</w:t>
+        <w:t>В нашем квартале, всего несколькими этажами выше моего уровня, располагалась просторная плаза с торговыми центрами, кафе, студиями развлечений и небольшими зелёными двориками, скрытыми между галереями. Это место никогда не пустовало: кто-то сидел в уличных лаунжах, кто-то созванивался по работе прямо на ходу, а кто-то зависал в игровых капсулах, встроенных в стены.</w:t>
       </w:r>
     </w:p>
     <w:p>
@@ -9122,11 +9093,7 @@
     </w:p>
     <w:p>
       <w:r>
-        <w:t xml:space="preserve">На вершине этой структуры находится Центральный, или Мировой Форум — орган, рассматривающий вопросы глобального масштаба: координацию общечеловеческих проектов, </w:t>
-      </w:r>
-      <w:r>
-        <w:lastRenderedPageBreak/>
-        <w:t>распределение ресурсов, межконтинентальные транспортные системы, крупные научные инициативы и безопасность в широком, системном смысле.</w:t>
+        <w:t>На вершине этой структуры находится Центральный, или Мировой Форум — орган, рассматривающий вопросы глобального масштаба: координацию общечеловеческих проектов, распределение ресурсов, межконтинентальные транспортные системы, крупные научные инициативы и безопасность в широком, системном смысле.</w:t>
       </w:r>
     </w:p>
     <w:p>
@@ -9191,7 +9158,6 @@
     </w:p>
     <w:p>
       <w:r>
-        <w:lastRenderedPageBreak/>
         <w:t>Дневник содержал его ставшую впоследствии классической работу «О Квинтэссенции», схемы квинт-насоса, и сканера Эссенции, а также пространную пояснительную записку.</w:t>
       </w:r>
     </w:p>
@@ -9252,11 +9218,7 @@
     </w:p>
     <w:p>
       <w:r>
-        <w:t xml:space="preserve">Именно в этот период был идентифицирован первый страйдер — Ритвик Шукарти. Он пережил Бурю в горах, а затем, случайно оказавшись вблизи Врат, обнаружил, что теперь видит их по-другому, не как раньше и не так, как другие люди. Заинтересовавшись этим фактом, Ритвик решил связаться с одной из исследовательских групп, занимавшейся разработками Хикару Югуры. Эта группа как раз незадолго до этого построила по чертежам Югуры модель сканера Эссенции, но попытки его применить поначалу не увенчались успехом. Тогда воспользоваться сканером попросили Ритвика. Дальнейшие события развивались стремительно. Ритвик увидел и описал поле Эссенции, разные её уровни у разных людей, отличие его собственного уровня и примерное его совпадение с пороговым уровнем во Вратах. Напрашивался очевидный вывод, который требовалось только подтвердить экспериментально. Не поколебавшись ни секунды, Ритвик вызвался добровольно попытаться войти во Врата. Так состоялся первый в истории межвариантный переход. Ритвик вошёл во Врата, зафиксировал всё, что обнаружил за ними, а затем, дождавшись восстановления своего уровня до </w:t>
-      </w:r>
-      <w:r>
-        <w:lastRenderedPageBreak/>
-        <w:t>порогового, вернулся обратно — по счастливому стечению обстоятельств он успел это сделать до того, как Вариант во Вратах переменился. Эксперименты продолжились, вскоре были обнаружены другие люди со способностями, аналогичными способностям Ритвика, и далее, шаг за шагом, мы узнали то, что сейчас знаем о Дельте и других Вариантах. При Мировом Форуме был создан Комитет Межвариантного Взаимодействия и три его исполнительных органа: Агентство Регулирования Квинтэссенции (АРК), Агентство Межвариантных Операций (АМО) и Агентство Межвариантного Сотрудничества и Развития (АМСР). В первом из них я имею честь и удовольствие работать.</w:t>
+        <w:t>Именно в этот период был идентифицирован первый страйдер — Ритвик Шукарти. Он пережил Бурю в горах, а затем, случайно оказавшись вблизи Врат, обнаружил, что теперь видит их по-другому, не как раньше и не так, как другие люди. Заинтересовавшись этим фактом, Ритвик решил связаться с одной из исследовательских групп, занимавшейся разработками Хикару Югуры. Эта группа как раз незадолго до этого построила по чертежам Югуры модель сканера Эссенции, но попытки его применить поначалу не увенчались успехом. Тогда воспользоваться сканером попросили Ритвика. Дальнейшие события развивались стремительно. Ритвик увидел и описал поле Эссенции, разные её уровни у разных людей, отличие его собственного уровня и примерное его совпадение с пороговым уровнем во Вратах. Напрашивался очевидный вывод, который требовалось только подтвердить экспериментально. Не поколебавшись ни секунды, Ритвик вызвался добровольно попытаться войти во Врата. Так состоялся первый в истории межвариантный переход. Ритвик вошёл во Врата, зафиксировал всё, что обнаружил за ними, а затем, дождавшись восстановления своего уровня до порогового, вернулся обратно — по счастливому стечению обстоятельств он успел это сделать до того, как Вариант во Вратах переменился. Эксперименты продолжились, вскоре были обнаружены другие люди со способностями, аналогичными способностям Ритвика, и далее, шаг за шагом, мы узнали то, что сейчас знаем о Дельте и других Вариантах. При Мировом Форуме был создан Комитет Межвариантного Взаимодействия и три его исполнительных органа: Агентство Регулирования Квинтэссенции (АРК), Агентство Межвариантных Операций (АМО) и Агентство Межвариантного Сотрудничества и Развития (АМСР). В первом из них я имею честь и удовольствие работать.</w:t>
       </w:r>
     </w:p>
     <w:p>
@@ -9314,7 +9276,6 @@
     </w:p>
     <w:p>
       <w:r>
-        <w:lastRenderedPageBreak/>
         <w:t>Четвёртый навык — безоружный контроль. Это не агрессивное нападение, а принятие атаки и работа с её импульсом: контроль дистанции, баланса и центра тяжести противника, освобождение от захватов, перенаправление силы, болевые и фиксирующие приёмы.</w:t>
       </w:r>
     </w:p>
@@ -9343,7 +9304,6 @@
       </w:pPr>
       <w:bookmarkStart w:id="23" w:name="_Toc238978499"/>
       <w:r>
-        <w:lastRenderedPageBreak/>
         <w:t>Глава 2. Большой Том</w:t>
       </w:r>
       <w:bookmarkEnd w:id="23"/>
@@ -9415,7 +9375,6 @@
     </w:p>
     <w:p>
       <w:r>
-        <w:lastRenderedPageBreak/>
         <w:t>Я повернул голову: Арт тоже сидел на траве, откинулась на такую же, как была подо мной, спинку-рюкзак.</w:t>
       </w:r>
     </w:p>
@@ -9511,11 +9470,7 @@
     </w:p>
     <w:p>
       <w:r>
-        <w:t xml:space="preserve">Приближающаяся звезда приняла очертания летательного аппарата, казалось, подсвеченного изнутри или со всех сторон. Я различил короткие, мощные крылья в виде горизонтальной "х" с </w:t>
-      </w:r>
-      <w:r>
-        <w:lastRenderedPageBreak/>
-        <w:t>утолщениями-пилонами на концах и ярко освещённую кабину посередине. В этот момент гул двигателей изменился, превратившись в свистящее шипение и став гораздо тише.</w:t>
+        <w:t>Приближающаяся звезда приняла очертания летательного аппарата, казалось, подсвеченного изнутри или со всех сторон. Я различил короткие, мощные крылья в виде горизонтальной "х" с утолщениями-пилонами на концах и ярко освещённую кабину посередине. В этот момент гул двигателей изменился, превратившись в свистящее шипение и став гораздо тише.</w:t>
       </w:r>
     </w:p>
     <w:p>
@@ -9590,7 +9545,6 @@
     </w:p>
     <w:p>
       <w:r>
-        <w:lastRenderedPageBreak/>
         <w:t>— Слушай… а как вообще выходит, что рюкзаки, наша одежда, обувь — всё это проходит во Врата вместе с нами?</w:t>
       </w:r>
     </w:p>
@@ -9678,7 +9632,6 @@
     </w:p>
     <w:p>
       <w:r>
-        <w:lastRenderedPageBreak/>
         <w:t>В тишине кабины прозвучал приятный двухнотный джингл, и перед нами возникло трёхмерное изображение участка глобуса с обозначенным над ним дугообразным маршрутом. В начале дуги светился крошечный значок нашего глайдера.</w:t>
       </w:r>
     </w:p>
@@ -9723,7 +9676,6 @@
       </w:pPr>
       <w:bookmarkStart w:id="25" w:name="_Toc238978500"/>
       <w:r>
-        <w:lastRenderedPageBreak/>
         <w:t>Глава 3. Полёт</w:t>
       </w:r>
       <w:bookmarkEnd w:id="25"/>
@@ -9825,7 +9777,6 @@
     </w:p>
     <w:p>
       <w:r>
-        <w:lastRenderedPageBreak/>
         <w:t>Когда движение воздуха вокруг меня прекратилось, из стены выехала панель с моими вещами — чистыми, сухими и чуть тёплыми. Я оделся, обулся и, чувствуя себя бодрым и свежим, вернулся в кресло.</w:t>
       </w:r>
     </w:p>
@@ -9950,7 +9901,6 @@
     </w:p>
     <w:p>
       <w:r>
-        <w:lastRenderedPageBreak/>
         <w:t>— Привет, Мак. Привет, Арт. Можно накрывать на стол? — произнесла «стиральная машина» бодрым молодым мужским голосом.</w:t>
       </w:r>
     </w:p>
@@ -10021,11 +9971,7 @@
     </w:p>
     <w:p>
       <w:r>
-        <w:t xml:space="preserve">К этому моменту мы уже разделались с остатками ужина, и Эстри незаметно убрал посуду, подав нам по чашке ароматного травяного чая. Арт взял блюдце с чашкой, откинулся на спинку кресла и с </w:t>
-      </w:r>
-      <w:r>
-        <w:lastRenderedPageBreak/>
-        <w:t>видимым удовольствием сделал маленький глоток. Я последовал его примеру. Значок нашего глайдера на висящей перед нами карте преодолел уже больше трёх четвертей маршрута, и под картой появилось сообщение:</w:t>
+        <w:t>К этому моменту мы уже разделались с остатками ужина, и Эстри незаметно убрал посуду, подав нам по чашке ароматного травяного чая. Арт взял блюдце с чашкой, откинулся на спинку кресла и с видимым удовольствием сделал маленький глоток. Я последовал его примеру. Значок нашего глайдера на висящей перед нами карте преодолел уже больше трёх четвертей маршрута, и под картой появилось сообщение:</w:t>
       </w:r>
     </w:p>
     <w:p>
@@ -10120,7 +10066,6 @@
     </w:p>
     <w:p>
       <w:r>
-        <w:lastRenderedPageBreak/>
         <w:t>Мы пролетали прямо над ним — над плавными дугами магистралей, над огненными шоссе скользящих по воздуху флоутеров, над сияющими башнями, которые выглядели отсюда как драгоценные иглы, утыкающиеся в небо. Местами свет стекал вниз по склонам холмов, образуя целые водопады огней, а где-то собирался в плотные геометрические кластеры, похожие на созвездия.</w:t>
       </w:r>
     </w:p>
@@ -10201,11 +10146,7 @@
     </w:p>
     <w:p>
       <w:r>
-        <w:t xml:space="preserve">Как будто услышав его слова, откуда-то сверху в пространство ангара скользнул солидного вида, по форме действительно похожий на огромный сейф, аппарат серебристого цвета. Дрон плавно </w:t>
-      </w:r>
-      <w:r>
-        <w:lastRenderedPageBreak/>
-        <w:t>приблизился и, замедляя движение, проскользил вниз, скрывшись под дном Большого Тома — и одновременно возникнув в виде полупрозрачного изображения на голограмме. Мы увидели как сейф пристыковывается к нижней поверхности нашего глайдера, при этом никакого толчка в момент стыковки я не почувствовал.</w:t>
+        <w:t>Как будто услышав его слова, откуда-то сверху в пространство ангара скользнул солидного вида, по форме действительно похожий на огромный сейф, аппарат серебристого цвета. Дрон плавно приблизился и, замедляя движение, проскользил вниз, скрывшись под дном Большого Тома — и одновременно возникнув в виде полупрозрачного изображения на голограмме. Мы увидели как сейф пристыковывается к нижней поверхности нашего глайдера, при этом никакого толчка в момент стыковки я не почувствовал.</w:t>
       </w:r>
     </w:p>
     <w:p>
@@ -10342,7 +10283,6 @@
     </w:p>
     <w:p>
       <w:r>
-        <w:lastRenderedPageBreak/>
         <w:t>Однако полностью исчезнуть городские огни не успели. И вскоре впереди выросла новая освещённая область — кольцо рассредоточенных огней, плавно, почти незаметно переливающихся мягкими оттенками, словно живущих какой-то своей, таинственной жизнью. Том спокойно опустился ниже, и я различил очертания утопающих в зелени и мягко подсвеченных небольших коттеджей. Как я понял, это был жилой комплекс сотрудников Агентств.</w:t>
       </w:r>
     </w:p>
@@ -10428,7 +10368,6 @@
     </w:p>
     <w:p>
       <w:r>
-        <w:lastRenderedPageBreak/>
         <w:t>— А здесь — ванная, — он «распахнул» другую стену. — С управлением и регулировками ты точно разберёшься — все устройства «умные», они сами поймут, что тебе нужно.</w:t>
       </w:r>
     </w:p>
@@ -10483,7 +10422,6 @@
       </w:pPr>
       <w:bookmarkStart w:id="26" w:name="_Toc238978501"/>
       <w:r>
-        <w:lastRenderedPageBreak/>
         <w:t>Глава 4. Интеграция</w:t>
       </w:r>
       <w:bookmarkEnd w:id="26"/>
@@ -10575,7 +10513,6 @@
     </w:p>
     <w:p>
       <w:r>
-        <w:lastRenderedPageBreak/>
         <w:t>И направился в ванную.</w:t>
       </w:r>
     </w:p>
@@ -10676,7 +10613,6 @@
     </w:p>
     <w:p>
       <w:r>
-        <w:lastRenderedPageBreak/>
         <w:t>«Может быть, даже не хуже, чем у Лемара», — подумалось мне, когда я принялся за еду.</w:t>
       </w:r>
     </w:p>
@@ -10772,11 +10708,7 @@
     </w:p>
     <w:p>
       <w:r>
-        <w:t xml:space="preserve">— Вопрос в самую точку, — одобрительно сказала Мона. — И ответ на него довольно простой. В обоих этих Вариантах об Эссенции знали ещё до появления Врат. В пятом Варианте уже много веков развивают и используют магию. Впрочем, слово «магия» у них считается устаревшим, вместо него они обычно используют понятие «Искусство Тонкого Поля» или просто «Филдкрафт». Эссенцию они </w:t>
-      </w:r>
-      <w:r>
-        <w:lastRenderedPageBreak/>
-        <w:t>называют Полевая Энергия и используют как фундаментальную основу всех «полевых» практик. А в шестом Варианте человечество пошло по пути биотехнологий. Они даже внешне отличаются от нас — сам увидишь. Так вот, их особое внимание к живой природе привело к тому, что они испокон веков знают о Квинтэссенции. У них она называется Праматерью и является объектом скорее сакрального почитания, чем утилитарного использования. Поэтому и их практики, связанные с Эссенцией, — это тоже, можно сказать, магия, но распространённая в основном в религиозных кругах.</w:t>
+        <w:t>— Вопрос в самую точку, — одобрительно сказала Мона. — И ответ на него довольно простой. В обоих этих Вариантах об Эссенции знали ещё до появления Врат. В пятом Варианте уже много веков развивают и используют магию. Впрочем, слово «магия» у них считается устаревшим, вместо него они обычно используют понятие «Искусство Тонкого Поля» или просто «Филдкрафт». Эссенцию они называют Полевая Энергия и используют как фундаментальную основу всех «полевых» практик. А в шестом Варианте человечество пошло по пути биотехнологий. Они даже внешне отличаются от нас — сам увидишь. Так вот, их особое внимание к живой природе привело к тому, что они испокон веков знают о Квинтэссенции. У них она называется Праматерью и является объектом скорее сакрального почитания, чем утилитарного использования. Поэтому и их практики, связанные с Эссенцией, — это тоже, можно сказать, магия, но распространённая в основном в религиозных кругах.</w:t>
       </w:r>
     </w:p>
     <w:p>
@@ -10821,11 +10753,7 @@
     </w:p>
     <w:p>
       <w:r>
-        <w:t xml:space="preserve">— Возвращаясь к твоему вопросу о том, как у нас дела с открытыми Вариантами. К счастью, в обоих случаях мы нашли взаимоприемлемые решения по Эссенции. С пятым Вариантом мы просто ею торгуем. Или, правильнее сказать, мы торгуем с ними не самой Эссенцией, а услугами по её сбору. Мы собираем у них квинту, передаём её им, но оставляем себе договоренную часть. Размер этой части не является постоянным, он зависит от множества изменяющихся факторов. В целом данное решение нравится и нашему Форуму, и их Совету Хранителей, и поэтому мы находимся в хороших, прагматических, партнёрских отношениях. Примерно то же можно сказать и о шестом Варианте. Они позволяют нам собирать для них — и только для них —строго определённое количество Эссенции. Это количество устанавливают жрецы Церкви Великой Праматери — считается, что это именно </w:t>
-      </w:r>
-      <w:r>
-        <w:lastRenderedPageBreak/>
-        <w:t>столько, сколько людям действительно необходимо, и не более того. И поэтому Великая Праматерь может даровать людям эту часть себя. Мы передаём им собранную Эссенцию, а в обмен на это они делятся с нами своими ресурсами и технологиями, и это тоже стало на практике весьма эффективным и сотрудничеством.</w:t>
+        <w:t>— Возвращаясь к твоему вопросу о том, как у нас дела с открытыми Вариантами. К счастью, в обоих случаях мы нашли взаимоприемлемые решения по Эссенции. С пятым Вариантом мы просто ею торгуем. Или, правильнее сказать, мы торгуем с ними не самой Эссенцией, а услугами по её сбору. Мы собираем у них квинту, передаём её им, но оставляем себе договоренную часть. Размер этой части не является постоянным, он зависит от множества изменяющихся факторов. В целом данное решение нравится и нашему Форуму, и их Совету Хранителей, и поэтому мы находимся в хороших, прагматических, партнёрских отношениях. Примерно то же можно сказать и о шестом Варианте. Они позволяют нам собирать для них — и только для них —строго определённое количество Эссенции. Это количество устанавливают жрецы Церкви Великой Праматери — считается, что это именно столько, сколько людям действительно необходимо, и не более того. И поэтому Великая Праматерь может даровать людям эту часть себя. Мы передаём им собранную Эссенцию, а в обмен на это они делятся с нами своими ресурсами и технологиями, и это тоже стало на практике весьма эффективным и сотрудничеством.</w:t>
       </w:r>
     </w:p>
     <w:p>
@@ -10894,7 +10822,6 @@
       </w:pPr>
       <w:bookmarkStart w:id="27" w:name="_Toc238978502"/>
       <w:r>
-        <w:lastRenderedPageBreak/>
         <w:t>Глава 5. Триллиум</w:t>
       </w:r>
       <w:bookmarkEnd w:id="27"/>
@@ -11001,7 +10928,6 @@
     </w:p>
     <w:p>
       <w:r>
-        <w:lastRenderedPageBreak/>
         <w:t>Арт едва заметно выпрямился.</w:t>
       </w:r>
     </w:p>
@@ -11136,7 +11062,6 @@
         </w:rPr>
       </w:pPr>
       <w:r>
-        <w:lastRenderedPageBreak/>
         <w:t>Это выглядело так естественно, будто я всегда так видел людей.</w:t>
       </w:r>
       <w:bookmarkEnd w:id="28"/>
@@ -11243,7 +11168,6 @@
       </w:pPr>
       <w:bookmarkStart w:id="29" w:name="_Toc238978503"/>
       <w:r>
-        <w:lastRenderedPageBreak/>
         <w:t>Глава 6. Афтепати</w:t>
       </w:r>
       <w:bookmarkEnd w:id="29"/>
@@ -11365,7 +11289,6 @@
     </w:p>
     <w:p>
       <w:r>
-        <w:lastRenderedPageBreak/>
         <w:t>Я поднялся, и мы обменялись рукопожатием.</w:t>
       </w:r>
     </w:p>
@@ -11461,7 +11384,6 @@
     </w:p>
     <w:p>
       <w:r>
-        <w:lastRenderedPageBreak/>
         <w:t>— Всем привет. Извините, что отвлекаю, я постараюсь коротко. Мак, привет, я — Карина, рада с тобой познакомиться. Будешь в нашем крыле — заходи в гости, поболтаем.</w:t>
       </w:r>
     </w:p>
@@ -11542,7 +11464,6 @@
     </w:p>
     <w:p>
       <w:r>
-        <w:lastRenderedPageBreak/>
         <w:t>Элен слегка кивнула, давая понять, что это всё, что она хотела добавить.</w:t>
       </w:r>
     </w:p>
@@ -11622,11 +11543,7 @@
       </w:r>
       <w:r>
         <w:br/>
-        <w:t xml:space="preserve">После обработки данных первого посещения девятого Варианта мы начали готовить группу для повторного перехода. И тут столкнулись с проблемой. И страйдеры, отобранные для второго перехода, и участники первой группы сообщили, что начали ощущать на себе то самое воздействие, которое во все годы существования Врат испытывали те, кто пытался исследовать или изучать Существ. Более того, при приближении страйдеров к Вратам это воздействие экспоненциально возрастает, превращаясь в буквально непереносимое. Никто не может приблизиться к Вратам, когда </w:t>
-      </w:r>
-      <w:r>
-        <w:lastRenderedPageBreak/>
-        <w:t>за ними находится девятый Вариант, ближе чем на десяток метров. Как и прежде в подобных ситуациях, никаких способов преодолеть это воздействие — или хотя бы понять его природу и механизмы — обнаружить не удалось. И это тот статус, в котором мы находимся на данный момент.</w:t>
+        <w:t>После обработки данных первого посещения девятого Варианта мы начали готовить группу для повторного перехода. И тут столкнулись с проблемой. И страйдеры, отобранные для второго перехода, и участники первой группы сообщили, что начали ощущать на себе то самое воздействие, которое во все годы существования Врат испытывали те, кто пытался исследовать или изучать Существ. Более того, при приближении страйдеров к Вратам это воздействие экспоненциально возрастает, превращаясь в буквально непереносимое. Никто не может приблизиться к Вратам, когда за ними находится девятый Вариант, ближе чем на десяток метров. Как и прежде в подобных ситуациях, никаких способов преодолеть это воздействие — или хотя бы понять его природу и механизмы — обнаружить не удалось. И это тот статус, в котором мы находимся на данный момент.</w:t>
       </w:r>
     </w:p>
     <w:p>
@@ -11721,7 +11638,6 @@
     </w:p>
     <w:p>
       <w:r>
-        <w:lastRenderedPageBreak/>
         <w:t>— Ион, — уверенно произнёс Арт.</w:t>
       </w:r>
     </w:p>
@@ -11807,7 +11723,6 @@
     </w:p>
     <w:p>
       <w:r>
-        <w:lastRenderedPageBreak/>
         <w:t>— Вот, собственно, и всё, — продолжил Маниш, — что касается аналитической части, которую мы считаем уместным предложить. Теперь, если нет вопросов или комментариев, мы можем перейти от анализа к синтезу — то есть к планированию дальнейших действий.</w:t>
       </w:r>
     </w:p>
@@ -11913,7 +11828,6 @@
     </w:p>
     <w:p>
       <w:r>
-        <w:lastRenderedPageBreak/>
         <w:t>Затем раздался спокойный голос Нортона:</w:t>
       </w:r>
     </w:p>
@@ -11994,11 +11908,7 @@
     </w:p>
     <w:p>
       <w:r>
-        <w:t xml:space="preserve">— Я могу связаться с ней и предложить встретиться, — сказал Арт. — Тогда утром у нас был совершенно нормальный разговор, мы обменялись сетевыми айди и… — он сделал едва заметную паузу, — договорились, что можем как-нибудь созвониться. Думаю, она не удивится ни моему звонку, </w:t>
-      </w:r>
-      <w:r>
-        <w:lastRenderedPageBreak/>
-        <w:t>ни предложению встретиться. Мы могли бы поужинать где-нибудь все вместе… Мы с Моной, Мак и Зара.</w:t>
+        <w:t>— Я могу связаться с ней и предложить встретиться, — сказал Арт. — Тогда утром у нас был совершенно нормальный разговор, мы обменялись сетевыми айди и… — он сделал едва заметную паузу, — договорились, что можем как-нибудь созвониться. Думаю, она не удивится ни моему звонку, ни предложению встретиться. Мы могли бы поужинать где-нибудь все вместе… Мы с Моной, Мак и Зара.</w:t>
       </w:r>
     </w:p>
     <w:p>
@@ -12117,7 +12027,6 @@
     </w:p>
     <w:p>
       <w:r>
-        <w:lastRenderedPageBreak/>
         <w:t>Нортон и Элен тоже направились к двери.</w:t>
       </w:r>
     </w:p>
@@ -12152,7 +12061,6 @@
       </w:pPr>
       <w:bookmarkStart w:id="30" w:name="_Toc238978504"/>
       <w:r>
-        <w:lastRenderedPageBreak/>
         <w:t>Глава 7. Обустройство</w:t>
       </w:r>
       <w:bookmarkEnd w:id="30"/>
@@ -12249,7 +12157,6 @@
     </w:p>
     <w:p>
       <w:r>
-        <w:lastRenderedPageBreak/>
         <w:t>Я вдруг очень ясно вспомнил, как однажды тяжело болел: высокая температура, лихорадка, мутное сознание, ощущение, будто само существование даётся с трудом. Тогда мне казалось, что хуже уже быть не может.</w:t>
       </w:r>
     </w:p>
@@ -12350,7 +12257,6 @@
     </w:p>
     <w:p>
       <w:r>
-        <w:lastRenderedPageBreak/>
         <w:t>Когда мы подошли к двери с надписью:</w:t>
       </w:r>
     </w:p>
@@ -12476,7 +12382,6 @@
     </w:p>
     <w:p>
       <w:r>
-        <w:lastRenderedPageBreak/>
         <w:t>— Процедура простая и быстрая. Не пугайся.</w:t>
       </w:r>
     </w:p>
@@ -12592,11 +12497,7 @@
     </w:p>
     <w:p>
       <w:r>
-        <w:t xml:space="preserve">Я внимательно его прочитал. Содержание я пересказывать не буду — оно конфиденциально, — скажу только, что я отметил про себя, что Кодекс показался мне логичным и, в каком-то смысле, даже </w:t>
-      </w:r>
-      <w:r>
-        <w:lastRenderedPageBreak/>
-        <w:t>обнадёживающим. В нём не было ни высокопарных деклараций, ни попыток переложить ответственность на абстрактные формулировки. Всё было сформулировано чётко и по делу.</w:t>
+        <w:t>Я внимательно его прочитал. Содержание я пересказывать не буду — оно конфиденциально, — скажу только, что я отметил про себя, что Кодекс показался мне логичным и, в каком-то смысле, даже обнадёживающим. В нём не было ни высокопарных деклараций, ни попыток переложить ответственность на абстрактные формулировки. Всё было сформулировано чётко и по делу.</w:t>
       </w:r>
     </w:p>
     <w:p>
@@ -12691,7 +12592,6 @@
     </w:p>
     <w:p>
       <w:r>
-        <w:lastRenderedPageBreak/>
         <w:t>Томас улыбнулся и, сделав приглашающий жест в сторону двери, вышел из-за стола.</w:t>
       </w:r>
     </w:p>
@@ -12706,7 +12606,6 @@
       </w:pPr>
       <w:bookmarkStart w:id="31" w:name="_Toc238978505"/>
       <w:r>
-        <w:lastRenderedPageBreak/>
         <w:t>Глава 8. Загрузка</w:t>
       </w:r>
       <w:bookmarkEnd w:id="31"/>
@@ -12853,7 +12752,6 @@
     </w:p>
     <w:p>
       <w:r>
-        <w:lastRenderedPageBreak/>
         <w:t xml:space="preserve">— А, ничего страшного, — отмахнулся Томас. — Я, если честно, ничего важного и не говорил. И да, — он усмехнулся, — после загрузки тебе сегодня вряд ли захочется с кем-то общаться. Так что Арт всё правильно спланировал. </w:t>
       </w:r>
     </w:p>
@@ -12954,7 +12852,6 @@
     </w:p>
     <w:p>
       <w:r>
-        <w:lastRenderedPageBreak/>
         <w:t>Первым быстрым уверенным шагом вошёл моложавый мужчина средних лет — или, наоборот, парень, выглядевший старше из-за уверенных движений. Его ярко-оранжевые волосы, подстриженные коротким «ёжиком», подчёркивали эту нарочитую моложавость. За ним следовала невысокая, миловидная девушка с короткой стрижкой, изящной фигурой и чертами лица, в которых угадывалась восточная или азиатская линия. Замыкал группу темнокожий парень с короткими густыми чёрными волосами и внимательным, чуть задумчивым взглядом.</w:t>
       </w:r>
     </w:p>
@@ -13030,7 +12927,6 @@
     </w:p>
     <w:p>
       <w:r>
-        <w:lastRenderedPageBreak/>
         <w:t>— Ну что, — грустно произнёс он, — переходим к формальностям. Протокольное представление.</w:t>
       </w:r>
     </w:p>
@@ -13166,7 +13062,6 @@
     </w:p>
     <w:p>
       <w:r>
-        <w:lastRenderedPageBreak/>
         <w:t>— А в третьем случае — наоборот. Я… немного отвлёкся на собственные воспоминания и передал клиенту информацию об одной своей подружке. Ну, в общем… о том, какие позиции она предпочитает.</w:t>
       </w:r>
     </w:p>
@@ -13271,7 +13166,6 @@
     </w:p>
     <w:p>
       <w:r>
-        <w:lastRenderedPageBreak/>
         <w:t>Иэн показал мне поднятый большой палец и снова повернулся к ассистентам.</w:t>
       </w:r>
     </w:p>
@@ -13382,7 +13276,6 @@
     </w:p>
     <w:p>
       <w:r>
-        <w:lastRenderedPageBreak/>
         <w:t>— Как ты себя чувствуешь, Мак?</w:t>
       </w:r>
     </w:p>
@@ -13497,7 +13390,6 @@
       </w:pPr>
       <w:bookmarkStart w:id="32" w:name="_Toc238978506"/>
       <w:r>
-        <w:lastRenderedPageBreak/>
         <w:t>Глава 9. Пробуждение</w:t>
       </w:r>
       <w:bookmarkEnd w:id="32"/>
@@ -13609,7 +13501,6 @@
     </w:p>
     <w:p>
       <w:r>
-        <w:lastRenderedPageBreak/>
         <w:t>Окружающее пространство тут же вернулось в своё обычное состояние: комната с аккуратно расстеленной кроватью, прозрачная стена-окно и лужайка за ней — ровно такие, какими они были вчера.</w:t>
       </w:r>
     </w:p>
@@ -13680,7 +13571,6 @@
     </w:p>
     <w:p>
       <w:r>
-        <w:lastRenderedPageBreak/>
         <w:t>И дело было не только в информации. В моей голове теперь жили воспоминания о другой жизни — жизни, прожитой здесь, в Варианте 1. Поэтому всё вокруг воспринималось не как новое и чужое, а как знакомое и логичное.</w:t>
       </w:r>
     </w:p>
@@ -13781,7 +13671,6 @@
     </w:p>
     <w:p>
       <w:r>
-        <w:lastRenderedPageBreak/>
         <w:t>Сообщение Арта</w:t>
       </w:r>
     </w:p>
@@ -13892,7 +13781,6 @@
     </w:p>
     <w:p>
       <w:r>
-        <w:lastRenderedPageBreak/>
         <w:t>— Да. С какого начинаем?</w:t>
       </w:r>
     </w:p>
@@ -13928,7 +13816,6 @@
       </w:pPr>
       <w:bookmarkStart w:id="33" w:name="_Toc238978507"/>
       <w:r>
-        <w:lastRenderedPageBreak/>
         <w:t>Глава 10. Закрытый полигон</w:t>
       </w:r>
       <w:bookmarkEnd w:id="33"/>
@@ -14028,7 +13915,6 @@
     </w:p>
     <w:p>
       <w:r>
-        <w:lastRenderedPageBreak/>
         <w:t>И в следующий момент Арт сорвался с места.</w:t>
       </w:r>
     </w:p>
@@ -14196,7 +14082,6 @@
     </w:p>
     <w:p>
       <w:r>
-        <w:lastRenderedPageBreak/>
         <w:t xml:space="preserve">В голове у меня было совершенно определённое и уверенное понимание того, что нужно делать. Мне казалось, что это будет так же легко, как сегодня утром управлять устройствами — всё само получится. </w:t>
       </w:r>
     </w:p>
@@ -14341,7 +14226,6 @@
     </w:p>
     <w:p>
       <w:r>
-        <w:lastRenderedPageBreak/>
         <w:t>Мех сразу же отпустил меня, поднялся и неподвижно замер.</w:t>
       </w:r>
     </w:p>
@@ -14532,7 +14416,6 @@
         </w:numPr>
       </w:pPr>
       <w:r>
-        <w:lastRenderedPageBreak/>
         <w:t>Пилотирование — 0 (+0)</w:t>
       </w:r>
     </w:p>
@@ -14646,7 +14529,6 @@
     </w:p>
     <w:p>
       <w:r>
-        <w:lastRenderedPageBreak/>
         <w:t>Я вздохнул с неимоверным облегчением.</w:t>
       </w:r>
     </w:p>
@@ -14686,7 +14568,6 @@
       </w:pPr>
       <w:bookmarkStart w:id="34" w:name="_Toc238978508"/>
       <w:r>
-        <w:lastRenderedPageBreak/>
         <w:t>Глава 11. Открытый полигон</w:t>
       </w:r>
       <w:bookmarkEnd w:id="34"/>
@@ -14758,7 +14639,6 @@
     </w:p>
     <w:p>
       <w:r>
-        <w:lastRenderedPageBreak/>
         <w:t>Это ощущение свободного полёта было головокружительным, пьянящим, переполняющим. Не знаю почему, но оно напомнило мне ощущение весны — свежего, сладкого весеннего воздуха и залитого солнечным светом, тихо радующегося жизни мира.</w:t>
       </w:r>
     </w:p>
@@ -14839,7 +14719,6 @@
     </w:p>
     <w:p>
       <w:r>
-        <w:lastRenderedPageBreak/>
         <w:t>— Всё просто, — прокомментировал Арт. — Твоя задача — пройти все чекпоинты за минимальное время. Начинай, когда готов.</w:t>
       </w:r>
     </w:p>
@@ -14965,7 +14844,6 @@
     </w:p>
     <w:p>
       <w:r>
-        <w:lastRenderedPageBreak/>
         <w:t>Арт улыбнулся.</w:t>
       </w:r>
     </w:p>
@@ -15077,7 +14955,6 @@
     </w:p>
     <w:p>
       <w:r>
-        <w:lastRenderedPageBreak/>
         <w:t>Начало Бури: 17… 18… 19… секунд назад</w:t>
       </w:r>
     </w:p>
@@ -15168,7 +15045,6 @@
       </w:pPr>
       <w:bookmarkStart w:id="36" w:name="_Toc238978509"/>
       <w:r>
-        <w:lastRenderedPageBreak/>
         <w:t>Глава 12. В ожидании</w:t>
       </w:r>
       <w:bookmarkEnd w:id="36"/>
@@ -15235,7 +15111,6 @@
     </w:p>
     <w:p>
       <w:r>
-        <w:lastRenderedPageBreak/>
         <w:t>Я только удивлённо округлил глаза, ещё не понимая, к чему он ведёт, и подозревая, что это просто оборот речи или пролог к одной из его шуток. Но оказалось — нет.</w:t>
       </w:r>
     </w:p>
@@ -15341,7 +15216,6 @@
     </w:p>
     <w:p>
       <w:r>
-        <w:lastRenderedPageBreak/>
         <w:t>Иэн кивнул, внимательно и чуть задумчиво глядя на меня. Сейчас он совсем не походил на того беззаботного и легкомысленного повесу, каким показался мне раньше. Передо мной сидел учёный и профессионал — один из тех самых «авторитетных людей», о которых он только что упомянул.</w:t>
       </w:r>
     </w:p>
@@ -15443,7 +15317,6 @@
     </w:p>
     <w:p>
       <w:r>
-        <w:lastRenderedPageBreak/>
         <w:t>— В любом случае, хорошо, что ты закончил курс подготовки и готов к работе. И, кстати, в этой связи у меня тоже есть новости. Я сегодня поговорил с Зарой. Набрал её сразу после того, как сдал шкатулку в хранилище.</w:t>
       </w:r>
     </w:p>
@@ -15544,7 +15417,6 @@
     </w:p>
     <w:p>
       <w:r>
-        <w:lastRenderedPageBreak/>
         <w:t>«Ларри, купи мне, пожалуйста, несколько комплектов одежды на все случаи жизни».</w:t>
       </w:r>
     </w:p>
@@ -15584,7 +15456,6 @@
       </w:pPr>
       <w:bookmarkStart w:id="37" w:name="_Toc238978510"/>
       <w:r>
-        <w:lastRenderedPageBreak/>
         <w:t>Глава 13. Дружеский ужин</w:t>
       </w:r>
       <w:bookmarkEnd w:id="37"/>
@@ -15686,7 +15557,6 @@
     </w:p>
     <w:p>
       <w:r>
-        <w:lastRenderedPageBreak/>
         <w:t>Пожимая друг другу руки и глядя в глаза, они на мгновение замерли — а потом вдруг рассмеялись и обнялись, как старые близкие подруги. Всё это выглядело так, как будто им обеим вдруг пришла какая-то мысль, и они обе поняли, что думают об одном и том же.</w:t>
       </w:r>
     </w:p>
@@ -15803,7 +15673,6 @@
     </w:p>
     <w:p>
       <w:r>
-        <w:lastRenderedPageBreak/>
         <w:t>Я заметил, что Арт и Зара к этому моменту тоже уже активно изучали свои меню. Я, не слишком уверенно, мысленно произнёс вроде бы запомненное мной одно из названий, упомянутых Кьюэлом — Каса Армелли. Передо мной тут же появились изображения блюд, и я начал их прокручивать.</w:t>
       </w:r>
     </w:p>
@@ -15924,7 +15793,6 @@
     </w:p>
     <w:p>
       <w:r>
-        <w:lastRenderedPageBreak/>
         <w:t>— Хмм… — сочувственно покивал Арт. — Наведывалась к своим?</w:t>
       </w:r>
     </w:p>
@@ -16055,7 +15923,6 @@
     </w:p>
     <w:p>
       <w:r>
-        <w:lastRenderedPageBreak/>
         <w:t>Арт вежливо-заинтересованно повернул голову.</w:t>
       </w:r>
     </w:p>
@@ -16146,11 +16013,7 @@
     </w:p>
     <w:p>
       <w:r>
-        <w:t xml:space="preserve">Мы трое на мгновение замерли. Немую паузу нарушил мех, влетевший к нам с блюдом Арта в одном манипуляторе и с его напитком — в другом. Установив всё это на стол и убрав пустой бокал, он </w:t>
-      </w:r>
-      <w:r>
-        <w:lastRenderedPageBreak/>
-        <w:t>поднёс манипулятор к блюду — и оно вспыхнуло красивым пламенем: красным, с голубыми прожилками. Дождавшись, пока огонь угаснет, мех исчез за голографической стеной.</w:t>
+        <w:t>Мы трое на мгновение замерли. Немую паузу нарушил мех, влетевший к нам с блюдом Арта в одном манипуляторе и с его напитком — в другом. Установив всё это на стол и убрав пустой бокал, он поднёс манипулятор к блюду — и оно вспыхнуло красивым пламенем: красным, с голубыми прожилками. Дождавшись, пока огонь угаснет, мех исчез за голографической стеной.</w:t>
       </w:r>
     </w:p>
     <w:p>
@@ -16275,7 +16138,6 @@
     </w:p>
     <w:p>
       <w:r>
-        <w:lastRenderedPageBreak/>
         <w:t>Зара вдруг замерла. Несколько секунд она оставалась совершенно неподвижной. Потом медленно перевела взгляд на меня и посмотрела прямо в глаза. В её взгляде читалось явное замешательство. А ещё… пожалуй, тревога.</w:t>
       </w:r>
     </w:p>
@@ -16401,7 +16263,6 @@
     </w:p>
     <w:p>
       <w:r>
-        <w:lastRenderedPageBreak/>
         <w:t>— Разумеется, твой вопрос вызван прежде всего пониманием того, что Зара явно что-то скрывает.</w:t>
       </w:r>
     </w:p>
@@ -16497,11 +16358,7 @@
     </w:p>
     <w:p>
       <w:r>
-        <w:t xml:space="preserve">— Моё мнение по данному вопросу: нет, не стоит. Появилась некоторая дополнительная неопределённость, но, я думаю, она не создаёт существенных дополнительных рисков или повышенного уровня опасности. И, вместе с тем, в сложившейся ситуации то, о чём говорил Мак на </w:t>
-      </w:r>
-      <w:r>
-        <w:lastRenderedPageBreak/>
-        <w:t xml:space="preserve">афтепати — информация и инициатива — становятся для нас ещё более ценными. Что вы думаете по этому поводу? </w:t>
+        <w:t xml:space="preserve">— Моё мнение по данному вопросу: нет, не стоит. Появилась некоторая дополнительная неопределённость, но, я думаю, она не создаёт существенных дополнительных рисков или повышенного уровня опасности. И, вместе с тем, в сложившейся ситуации то, о чём говорил Мак на афтепати — информация и инициатива — становятся для нас ещё более ценными. Что вы думаете по этому поводу? </w:t>
       </w:r>
     </w:p>
     <w:p>
@@ -16616,7 +16473,6 @@
     </w:p>
     <w:p>
       <w:r>
-        <w:lastRenderedPageBreak/>
         <w:t>На пороге стояла Зара.</w:t>
       </w:r>
     </w:p>
@@ -16652,7 +16508,6 @@
       </w:pPr>
       <w:bookmarkStart w:id="38" w:name="_Toc238978511"/>
       <w:r>
-        <w:lastRenderedPageBreak/>
         <w:t>Глава 14. Ложная память 2: Погонщик драконов</w:t>
       </w:r>
       <w:bookmarkEnd w:id="38"/>
@@ -16714,7 +16569,6 @@
     </w:p>
     <w:p>
       <w:r>
-        <w:lastRenderedPageBreak/>
         <w:t>Не всякий, конечно, может погонщиком стать. Многие, кто пробуют седлать дракона, не удерживаются с первого раза — сбрасывает их дракон. И тогда, конечно, человек либо насмерть разбивается, либо тяжёлые увечья получает. Потому и уважают нас, погонщиков, и платят хорошо.</w:t>
       </w:r>
     </w:p>
@@ -16770,7 +16624,6 @@
     </w:p>
     <w:p>
       <w:r>
-        <w:lastRenderedPageBreak/>
         <w:t>Размером они с телёнка и отличаются силой, скоростью и свирепостью. По приказу хозяина такой хан-волк может любого человека загрызть, и никто от них защититься не может. А хозяином хан-волка может быть только один человек — а точнее, один орк — тот, кто его ещё волчонком приручил и особым образом вырастил. Хоть и говорит кое-кто, что всё это россказни, но мне почему-то верится. Я вообще колдунам верю — видно по ним, что знают они многое, о чём другим людям неведомо.</w:t>
       </w:r>
     </w:p>
@@ -16840,7 +16693,6 @@
       </w:pPr>
       <w:bookmarkStart w:id="39" w:name="_Toc238978512"/>
       <w:r>
-        <w:lastRenderedPageBreak/>
         <w:t>Эпилог</w:t>
       </w:r>
       <w:bookmarkEnd w:id="39"/>
@@ -16917,11 +16769,7 @@
     </w:p>
     <w:p>
       <w:r>
-        <w:t xml:space="preserve">Сейчас, снова вспомнив всё это, я глубоко вздохнул и постарался переключиться на нечто более актуальное. Я подумал о своих ощущениях после второго перехода. На этот раз всё прошло гораздо </w:t>
-      </w:r>
-      <w:r>
-        <w:lastRenderedPageBreak/>
-        <w:t>легче — видимо, организм уже знал, чего ожидать, и подсознательно к этому подготовился. Сейчас я чувствовал, что прихожу в себя намного быстрее и уже почти вернулся в норму.</w:t>
+        <w:t>Сейчас, снова вспомнив всё это, я глубоко вздохнул и постарался переключиться на нечто более актуальное. Я подумал о своих ощущениях после второго перехода. На этот раз всё прошло гораздо легче — видимо, организм уже знал, чего ожидать, и подсознательно к этому подготовился. Сейчас я чувствовал, что прихожу в себя намного быстрее и уже почти вернулся в норму.</w:t>
       </w:r>
     </w:p>
     <w:p>
@@ -18048,6 +17896,7 @@
   <w:style w:type="character" w:default="1" w:styleId="DefaultParagraphFont">
     <w:name w:val="Default Paragraph Font"/>
     <w:uiPriority w:val="1"/>
+    <w:semiHidden/>
     <w:unhideWhenUsed/>
   </w:style>
   <w:style w:type="table" w:default="1" w:styleId="TableNormal">

</xml_diff>